<commit_message>
docs: fill in team member info in the contest report
Add 팀장 서하늘, 오윤식, 조준영 with roles split across AI/service
planning, frontend, and backend/data integration based on the
project's actual tech stack.

Co-Authored-By: Claude Sonnet 5 <noreply@anthropic.com>
Claude-Session: https://claude.ai/code/session_01QMCLGveTrYj3khsHPNtSZF
</commit_message>
<xml_diff>
--- a/오픈소스개발자대회_결과보고서.docx
+++ b/오픈소스개발자대회_결과보고서.docx
@@ -248,7 +248,39 @@
                 <w:sz w:val="20"/>
                 <w:szCs w:val="20"/>
               </w:rPr>
-              <w:t xml:space="preserve">[ 팀원 이름 · 역할을 입력하세요 (예: 홍길동 - 프론트엔드/AI 연동) ]</w:t>
+              <w:t xml:space="preserve">서하늘 (팀장) — 서비스 기획 · AI 연동 (Claude 프롬프트/응답 설계)</w:t>
+            </w:r>
+          </w:p>
+          <w:p>
+            <w:pPr>
+              <w:spacing w:before="40"/>
+            </w:pPr>
+            <w:r>
+              <w:rPr>
+                <w:rFonts w:ascii="맑은 고딕" w:cs="맑은 고딕" w:eastAsia="맑은 고딕" w:hAnsi="맑은 고딕"/>
+                <w:b w:val="false"/>
+                <w:bCs w:val="false"/>
+                <w:color w:val="0F172A"/>
+                <w:sz w:val="20"/>
+                <w:szCs w:val="20"/>
+              </w:rPr>
+              <w:t xml:space="preserve">오윤식 — 프론트엔드 개발 (React UI/UX, PWA)</w:t>
+            </w:r>
+          </w:p>
+          <w:p>
+            <w:pPr>
+              <w:spacing w:before="40"/>
+            </w:pPr>
+            <w:r>
+              <w:rPr>
+                <w:rFonts w:ascii="맑은 고딕" w:cs="맑은 고딕" w:eastAsia="맑은 고딕" w:hAnsi="맑은 고딕"/>
+                <w:b w:val="false"/>
+                <w:bCs w:val="false"/>
+                <w:color w:val="0F172A"/>
+                <w:sz w:val="20"/>
+                <w:szCs w:val="20"/>
+              </w:rPr>
+              <w:t xml:space="preserve">조준영 — 백엔드·데이터 연동 (Vercel Serverless, 공공데이터 API, Supabase)</w:t>
             </w:r>
           </w:p>
         </w:tc>
@@ -3807,7 +3839,7 @@
           <w:highlight w:val="yellow"/>
           <w:highlightCs w:val="yellow"/>
         </w:rPr>
-        <w:t xml:space="preserve">※ 이 문서는 초안입니다. 강조 표시된 항목(부문/팀 정보)과 시연 스크린샷을 채운 뒤 제출해 주세요.</w:t>
+        <w:t xml:space="preserve">※ 이 문서는 초안입니다. 강조 표시된 항목(참가 부문, 팀명)과 시연 스크린샷을 채운 뒤 제출해 주세요.</w:t>
       </w:r>
     </w:p>
     <w:sectPr>

</xml_diff>

<commit_message>
test: add vitest suite, CI workflow, and contributor docs
- Add vitest with unit tests for the safety-critical emergency
  keyword detection and the AI/offline fallback logic in
  src/services/claude.js, plus profile/history storage in
  src/services/storage.js (22 tests).
- Add GitHub Actions workflow to run install/test/build on every
  push and PR.
- Add CONTRIBUTING.md, issue templates, and a PR template so the
  project is actually set up to take outside contributions, as
  expected for an open-source contest submission.
- Document testing/contributing in README and reflect the new
  setup in the contest report draft.

Co-Authored-By: Claude Sonnet 5 <noreply@anthropic.com>
Claude-Session: https://claude.ai/code/session_01QMCLGveTrYj3khsHPNtSZF
</commit_message>
<xml_diff>
--- a/오픈소스개발자대회_결과보고서.docx
+++ b/오픈소스개발자대회_결과보고서.docx
@@ -1813,6 +1813,37 @@
           <w:szCs w:val="21"/>
         </w:rPr>
         <w:t xml:space="preserve">외부 AI·공공데이터 API 호출이 실패하거나 키가 설정되지 않은 경우, 각 서비스 모듈은 규칙 기반 폴백 로직(getFallbackQueryResult, getMockExplanation, getMockSubwayGuide 등)으로 자동 전환되어 서비스가 끊기지 않도록 설계했다. 이는 고령자·응급 상황을 다루는 서비스 특성상 가용성을 최우선으로 고려한 결정이다.</w:t>
+      </w:r>
+    </w:p>
+    <w:p>
+      <w:pPr>
+        <w:pStyle w:val="Heading2"/>
+        <w:spacing w:after="120" w:before="260"/>
+      </w:pPr>
+      <w:r>
+        <w:rPr>
+          <w:rFonts w:ascii="맑은 고딕" w:cs="맑은 고딕" w:eastAsia="맑은 고딕" w:hAnsi="맑은 고딕"/>
+          <w:b/>
+          <w:bCs/>
+          <w:color w:val="0F172A"/>
+          <w:sz w:val="24"/>
+          <w:szCs w:val="24"/>
+        </w:rPr>
+        <w:t xml:space="preserve">4.4 테스트 및 CI</w:t>
+      </w:r>
+    </w:p>
+    <w:p>
+      <w:pPr>
+        <w:spacing w:after="160" w:line="300"/>
+      </w:pPr>
+      <w:r>
+        <w:rPr>
+          <w:rFonts w:ascii="맑은 고딕" w:cs="맑은 고딕" w:eastAsia="맑은 고딕" w:hAnsi="맑은 고딕"/>
+          <w:color w:val="0F172A"/>
+          <w:sz w:val="21"/>
+          <w:szCs w:val="21"/>
+        </w:rPr>
+        <w:t xml:space="preserve">Vitest로 응급 키워드 감지(checkEmergency), AI 응답 실패 시 폴백 로직(parseUserQuery, generateSubwayGuide), 프로필·이동 이력 저장(storage.js) 등 핵심 로직에 대한 단위 테스트를 작성했다. GitHub Actions(.github/workflows/ci.yml)가 push/PR마다 설치·테스트·빌드를 자동 실행해 회귀를 조기에 발견한다.</w:t>
       </w:r>
     </w:p>
     <w:p>
@@ -2615,7 +2646,7 @@
                 <w:sz w:val="20"/>
                 <w:szCs w:val="20"/>
               </w:rPr>
-              <w:t xml:space="preserve">OpenStreetMap / Nominatim</w:t>
+              <w:t xml:space="preserve">Vitest</w:t>
             </w:r>
           </w:p>
         </w:tc>
@@ -2641,7 +2672,7 @@
                 <w:sz w:val="20"/>
                 <w:szCs w:val="20"/>
               </w:rPr>
-              <w:t xml:space="preserve">지도 타일 및 역지오코딩</w:t>
+              <w:t xml:space="preserve">단위 테스트</w:t>
             </w:r>
           </w:p>
         </w:tc>
@@ -2649,6 +2680,86 @@
           <w:tcPr>
             <w:tcW w:type="dxa" w:w="2200"/>
             <w:shd w:fill="FFFFFF" w:color="auto" w:val="clear"/>
+            <w:tcMar>
+              <w:top w:type="dxa" w:w="90"/>
+              <w:left w:type="dxa" w:w="120"/>
+              <w:bottom w:type="dxa" w:w="90"/>
+              <w:right w:type="dxa" w:w="120"/>
+            </w:tcMar>
+            <w:vAlign w:val="center"/>
+          </w:tcPr>
+          <w:p>
+            <w:r>
+              <w:rPr>
+                <w:rFonts w:ascii="맑은 고딕" w:cs="맑은 고딕" w:eastAsia="맑은 고딕" w:hAnsi="맑은 고딕"/>
+                <w:b w:val="false"/>
+                <w:bCs w:val="false"/>
+                <w:color w:val="0F172A"/>
+                <w:sz w:val="20"/>
+                <w:szCs w:val="20"/>
+              </w:rPr>
+              <w:t xml:space="preserve">MIT</w:t>
+            </w:r>
+          </w:p>
+        </w:tc>
+      </w:tr>
+      <w:tr>
+        <w:tc>
+          <w:tcPr>
+            <w:tcW w:type="dxa" w:w="3200"/>
+            <w:shd w:fill="F8FAFC" w:color="auto" w:val="clear"/>
+            <w:tcMar>
+              <w:top w:type="dxa" w:w="90"/>
+              <w:left w:type="dxa" w:w="120"/>
+              <w:bottom w:type="dxa" w:w="90"/>
+              <w:right w:type="dxa" w:w="120"/>
+            </w:tcMar>
+            <w:vAlign w:val="center"/>
+          </w:tcPr>
+          <w:p>
+            <w:r>
+              <w:rPr>
+                <w:rFonts w:ascii="맑은 고딕" w:cs="맑은 고딕" w:eastAsia="맑은 고딕" w:hAnsi="맑은 고딕"/>
+                <w:b w:val="false"/>
+                <w:bCs w:val="false"/>
+                <w:color w:val="0F172A"/>
+                <w:sz w:val="20"/>
+                <w:szCs w:val="20"/>
+              </w:rPr>
+              <w:t xml:space="preserve">OpenStreetMap / Nominatim</w:t>
+            </w:r>
+          </w:p>
+        </w:tc>
+        <w:tc>
+          <w:tcPr>
+            <w:tcW w:type="dxa" w:w="3600"/>
+            <w:shd w:fill="F8FAFC" w:color="auto" w:val="clear"/>
+            <w:tcMar>
+              <w:top w:type="dxa" w:w="90"/>
+              <w:left w:type="dxa" w:w="120"/>
+              <w:bottom w:type="dxa" w:w="90"/>
+              <w:right w:type="dxa" w:w="120"/>
+            </w:tcMar>
+            <w:vAlign w:val="center"/>
+          </w:tcPr>
+          <w:p>
+            <w:r>
+              <w:rPr>
+                <w:rFonts w:ascii="맑은 고딕" w:cs="맑은 고딕" w:eastAsia="맑은 고딕" w:hAnsi="맑은 고딕"/>
+                <w:b w:val="false"/>
+                <w:bCs w:val="false"/>
+                <w:color w:val="0F172A"/>
+                <w:sz w:val="20"/>
+                <w:szCs w:val="20"/>
+              </w:rPr>
+              <w:t xml:space="preserve">지도 타일 및 역지오코딩</w:t>
+            </w:r>
+          </w:p>
+        </w:tc>
+        <w:tc>
+          <w:tcPr>
+            <w:tcW w:type="dxa" w:w="2200"/>
+            <w:shd w:fill="F8FAFC" w:color="auto" w:val="clear"/>
             <w:tcMar>
               <w:top w:type="dxa" w:w="90"/>
               <w:left w:type="dxa" w:w="120"/>
@@ -3299,7 +3410,7 @@
           <w:sz w:val="21"/>
           <w:szCs w:val="21"/>
         </w:rPr>
-        <w:t xml:space="preserve">프로젝트 전체 소스코드는 MIT License로 GitHub 공개 저장소(tjgksmf1012/silverpass-seoul)에 공개되어 있으며, README에 로컬 실행·환경변수 설정·배포 방법을 문서화해 외부 개발자의 실행과 기여가 가능하도록 했다.</w:t>
+        <w:t xml:space="preserve">프로젝트 전체 소스코드는 MIT License로 GitHub 공개 저장소(tjgksmf1012/silverpass-seoul)에 공개되어 있으며, README에 로컬 실행·환경변수 설정·배포 방법을 문서화해 외부 개발자의 실행과 기여가 가능하도록 했다. CONTRIBUTING.md에 개발 환경 설정과 PR 절차를, 이슈/PR 템플릿에 버그 리포트·기능 제안 양식을 갖춰 외부 기여를 받을 수 있는 구조를 마련했다.</w:t>
       </w:r>
     </w:p>
     <w:p>

</xml_diff>

<commit_message>
feat: display official system name at the top of the app
이해인 교수님 요청: 로그인 화면 브랜드 영역과 홈 화면 상단에
"고령자 맞춤형 이동 지원을 위한 생성형 AI 기반 공공데이터 융합
시스템" 명칭을 노출. 결과보고서 표지에도 동일하게 반영해 제출
자료와 실제 앱 화면이 일치하도록 함.

Co-Authored-By: Claude Sonnet 5 <noreply@anthropic.com>
Claude-Session: https://claude.ai/code/session_01QMCLGveTrYj3khsHPNtSZF
</commit_message>
<xml_diff>
--- a/오픈소스개발자대회_결과보고서.docx
+++ b/오픈소스개발자대회_결과보고서.docx
@@ -56,6 +56,23 @@
           <w:szCs w:val="56"/>
         </w:rPr>
         <w:t xml:space="preserve">실버패스 서울 Care</w:t>
+      </w:r>
+    </w:p>
+    <w:p>
+      <w:pPr>
+        <w:spacing w:after="120"/>
+        <w:jc w:val="center"/>
+      </w:pPr>
+      <w:r>
+        <w:rPr>
+          <w:rFonts w:ascii="맑은 고딕" w:cs="맑은 고딕" w:eastAsia="맑은 고딕" w:hAnsi="맑은 고딕"/>
+          <w:b/>
+          <w:bCs/>
+          <w:color w:val="0F766E"/>
+          <w:sz w:val="22"/>
+          <w:szCs w:val="22"/>
+        </w:rPr>
+        <w:t xml:space="preserve">고령자 맞춤형 이동 지원을 위한 생성형 AI 기반 공공데이터 융합 시스템</w:t>
       </w:r>
     </w:p>
     <w:p>

</xml_diff>